<commit_message>
docs: add InventIC authorship details
</commit_message>
<xml_diff>
--- a/docs/manuales/Manual de Usuario InventIC.docx
+++ b/docs/manuales/Manual de Usuario InventIC.docx
@@ -16,9 +16,9 @@
           <w:rFonts w:ascii="Aptos Display" w:hAnsi="Aptos Display"/>
           <w:b/>
           <w:color w:val="07356B"/>
-          <w:sz w:val="60"/>
+          <w:sz w:val="56"/>
         </w:rPr>
-        <w:t>INVENTIC</w:t>
+        <w:t>InventIC-IEP San Rafael</w:t>
       </w:r>
     </w:p>
     <w:p>
@@ -248,7 +248,7 @@
                 <w:b w:val="0"/>
                 <w:sz w:val="18"/>
               </w:rPr>
-              <w:t>InventIC - TECNO-GEST</w:t>
+              <w:t>InventIC-IEP San Rafael</w:t>
             </w:r>
           </w:p>
         </w:tc>
@@ -292,7 +292,9 @@
                 <w:b w:val="0"/>
                 <w:sz w:val="18"/>
               </w:rPr>
-              <w:t>________________________________________</w:t>
+              <w:t>Jesús Ernesto Domínguez Reyes</w:t>
+              <w:br/>
+              <w:t>José Baltazar Beltrán Gómez</w:t>
             </w:r>
           </w:p>
         </w:tc>
@@ -334,7 +336,7 @@
                 <w:b w:val="0"/>
                 <w:sz w:val="18"/>
               </w:rPr>
-              <w:t>________________________________________</w:t>
+              <w:t>Danilo Antonio Pérez Melara</w:t>
             </w:r>
           </w:p>
         </w:tc>
@@ -653,7 +655,7 @@
     </w:p>
     <w:p>
       <w:r>
-        <w:t>InventIC es una aplicación web para registrar y consultar equipos institucionales, controlar préstamos, reportar fallas y dar seguimiento al mantenimiento. Centraliza la información de los equipos por sede y ubicación para que el inventario se mantenga actualizado.</w:t>
+        <w:t>InventIC-IEP San Rafael es una aplicación web para registrar y consultar equipos institucionales, controlar préstamos, reportar fallas y dar seguimiento al mantenimiento. Centraliza la información de los equipos por sede y ubicación para que el inventario se mantenga actualizado.</w:t>
       </w:r>
     </w:p>
     <w:p>
@@ -2813,7 +2815,7 @@
     </w:p>
     <w:p>
       <w:r>
-        <w:t>InventIC permite que las decisiones sobre equipos se basen en un inventario, préstamos y mantenimientos registrados. El uso consistente de cada módulo mantiene la información disponible para toda la institución.</w:t>
+        <w:t>InventIC-IEP San Rafael permite que las decisiones sobre equipos se basen en un inventario, préstamos y mantenimientos registrados. El uso consistente de cada módulo mantiene la información disponible para toda la institución.</w:t>
       </w:r>
     </w:p>
     <w:sectPr>

</xml_diff>